<commit_message>
fix(document-engine): the event registers' headers break words at syllables, and register 4's title is set like the others
Soft hyphens where the original hyphenated by hand (comuni-cării, inspec-torat,
calen-daristice, Împreju-rările); "PENTRU <client>" inline in register 4's title.

Claude-Session: https://claude.ai/code/session_01A9qjCHVH6kcDAEKFiJoShR
</commit_message>
<xml_diff>
--- a/packages/document-engine/templates/7.2_event_registers.docx
+++ b/packages/document-engine/templates/7.2_event_registers.docx
@@ -585,7 +585,7 @@
                 <w:szCs w:val="14"/>
                 <w:lang w:val="ro-RO"/>
               </w:rPr>
-              <w:t>Împrejurările, cauzele accidentării</w:t>
+              <w:t>Împreju­rările, cauzele accidentării</w:t>
             </w:r>
           </w:p>
         </w:tc>
@@ -773,7 +773,7 @@
                 <w:szCs w:val="14"/>
                 <w:lang w:val="ro-RO"/>
               </w:rPr>
-              <w:t>Nr. zile ITM (calendaristice)</w:t>
+              <w:t>Nr. zile ITM (calen­daristice)</w:t>
             </w:r>
           </w:p>
         </w:tc>
@@ -1322,7 +1322,7 @@
                 <w:szCs w:val="14"/>
                 <w:lang w:val="ro-RO"/>
               </w:rPr>
-              <w:t>Data comunicării la inspectorat. T: transmis, P: primit (numele persoanei)</w:t>
+              <w:t>Data comuni­cării la inspec­torat. T: transmis, P: primit (numele persoanei)</w:t>
             </w:r>
           </w:p>
         </w:tc>
@@ -1506,7 +1506,7 @@
                 <w:szCs w:val="14"/>
                 <w:lang w:val="ro-RO"/>
               </w:rPr>
-              <w:t>Data comunicării la inspectorat. T: transmis, P: primit (numele persoanei)</w:t>
+              <w:t>Data comuni­cării la inspec­torat. T: transmis, P: primit (numele persoanei)</w:t>
             </w:r>
           </w:p>
         </w:tc>
@@ -2182,7 +2182,7 @@
                 <w:szCs w:val="14"/>
                 <w:lang w:val="ro-RO"/>
               </w:rPr>
-              <w:t>Data comunicării la inspectorat. T: transmis, P: primit (numele persoanei)</w:t>
+              <w:t>Data comuni­cării la inspec­torat. T: transmis, P: primit (numele persoanei)</w:t>
             </w:r>
           </w:p>
         </w:tc>
@@ -7933,7 +7933,7 @@
                 <w:szCs w:val="16"/>
                 <w:lang w:val="ro-RO"/>
               </w:rPr>
-              <w:t>Data transmiterii operative la inspectorat. T: transmis, P: primit (numele persoanei)</w:t>
+              <w:t>Data transmiterii operative la inspec­torat. T: transmis, P: primit (numele persoanei)</w:t>
             </w:r>
           </w:p>
         </w:tc>
@@ -18214,7 +18214,7 @@
         <w:pStyle w:val="Normal"/>
         <w:keepNext w:val="true"/>
         <w:widowControl/>
-        <w:spacing w:before="120" w:after="0"/>
+        <w:spacing w:before="120" w:after="120"/>
         <w:ind w:hanging="0"/>
         <w:jc w:val="center"/>
         <w:rPr>
@@ -18242,37 +18242,7 @@
           <w:szCs w:val="20"/>
           <w:lang w:val="ro-RO"/>
         </w:rPr>
-        <w:t>REGISTRUL UNIC DE EVIDENȚĂ A ACCIDENTAȚILOR ÎN MUNCĂ CE AU CA URMARE INCAPACITATE DE MUNCĂ MAI MARE DE 3 ZILE DE LUCRU</w:t>
-      </w:r>
-    </w:p>
-    <w:p>
-      <w:pPr>
-        <w:pStyle w:val="Normal"/>
-        <w:keepNext w:val="true"/>
-        <w:widowControl/>
-        <w:spacing w:before="0" w:after="240"/>
-        <w:ind w:hanging="0"/>
-        <w:jc w:val="center"/>
-        <w:rPr>
-          <w:rFonts w:ascii="Arial" w:hAnsi="Arial" w:cs="Arial"/>
-          <w:b/>
-          <w:sz w:val="20"/>
-          <w:szCs w:val="20"/>
-        </w:rPr>
-      </w:pPr>
-      <w:r>
-        <w:rPr>
-          <w:rStyle w:val="tpa1"/>
-          <w:rFonts w:eastAsia="Arial" w:cs="Arial" w:ascii="Arial" w:hAnsi="Arial"/>
-          <w:b/>
-          <w:color w:val="auto"/>
-          <w:spacing w:val="0"/>
-          <w:w w:val="100"/>
-          <w:sz w:val="20"/>
-          <w:szCs w:val="20"/>
-          <w:lang w:val="ro-RO"/>
-        </w:rPr>
-        <w:t>PENTRU {{client.legalName}}</w:t>
+        <w:t>REGISTRUL UNIC DE EVIDENȚĂ A ACCIDENTAȚILOR ÎN MUNCĂ CE AU CA URMARE INCAPACITATE DE MUNCĂ MAI MARE DE 3 ZILE DE LUCRU PENTRU {{client.legalName}}</w:t>
       </w:r>
     </w:p>
     <w:tbl>
@@ -18995,7 +18965,7 @@
                 <w:szCs w:val="14"/>
                 <w:lang w:val="ro-RO"/>
               </w:rPr>
-              <w:t>Data comunicării la ITM. T: transmis, P: primit (numele persoanei)</w:t>
+              <w:t>Data comuni­cării la ITM. T: transmis, P: primit (numele persoanei)</w:t>
             </w:r>
           </w:p>
         </w:tc>
@@ -19042,7 +19012,7 @@
                 <w:szCs w:val="14"/>
                 <w:lang w:val="ro-RO"/>
               </w:rPr>
-              <w:t>Perioada calendaristică</w:t>
+              <w:t>Perioada calen­daristică</w:t>
             </w:r>
           </w:p>
         </w:tc>

</xml_diff>

<commit_message>
fix(templates): the event registers' column headers follow H.G. 1425/2006 annexes 15 to 18
Checked against the annexes' tables as published (forma de bază, legislatie.just.ro 76341;
the consolidated text of 07.03.2022, 252029, leaves annexes 15–18 unamended):
register 1 (annex 15) "Împrejurările, cauzele accidentării" → "Împrejurare, cauzele
accidentării" and "Data/ora accidentării prin" → "Data/ora accidentării prin:"; register 3
(annex 17) "Data, ora accidentării" → "Data/ora accidentării"; register 4 (annex 18)
"Împrejurarea, cauzele accidentării" → "Împrejurare, cauzele accidentării" and
"Invaliditate: nr., data deciziei; grad inv." → "Invaliditate Nr.; data deciziei; grad
inv."; registers 1, 3 and 4 "vechime la locul de muncă" → "vechime la loc de muncă"; all
four "(cod CAEN)" → "(Cod CAEN)". Register 3's two "Cu incapacitate de muncă" headers
already read as annex 17 does.

Claude-Session: https://claude.ai/code/session_01A9qjCHVH6kcDAEKFiJoShR
</commit_message>
<xml_diff>
--- a/packages/document-engine/templates/7.2_event_registers.docx
+++ b/packages/document-engine/templates/7.2_event_registers.docx
@@ -397,7 +397,7 @@
                 <w:szCs w:val="14"/>
                 <w:lang w:val="ro-RO"/>
               </w:rPr>
-              <w:t>vechime la locul de muncă</w:t>
+              <w:t xml:space="preserve">vechime la loc de muncă</w:t>
             </w:r>
           </w:p>
         </w:tc>
@@ -538,7 +538,7 @@
                 <w:szCs w:val="14"/>
                 <w:lang w:val="ro-RO"/>
               </w:rPr>
-              <w:t>Activitatea economică în care s-a accidentat victima (cod CAEN)</w:t>
+              <w:t xml:space="preserve">Activitatea economică în care s-a accidentat victima (Cod CAEN)</w:t>
             </w:r>
           </w:p>
         </w:tc>
@@ -585,7 +585,7 @@
                 <w:szCs w:val="14"/>
                 <w:lang w:val="ro-RO"/>
               </w:rPr>
-              <w:t>Împreju­rările, cauzele accidentării</w:t>
+              <w:t xml:space="preserve">Împreju­rare, cauzele accidentării</w:t>
             </w:r>
           </w:p>
         </w:tc>
@@ -679,7 +679,7 @@
                 <w:szCs w:val="14"/>
                 <w:lang w:val="ro-RO"/>
               </w:rPr>
-              <w:t>Data/ora accidentării prin</w:t>
+              <w:t xml:space="preserve">Data/ora accidentării prin:</w:t>
             </w:r>
           </w:p>
         </w:tc>
@@ -7841,7 +7841,7 @@
                 <w:szCs w:val="16"/>
                 <w:lang w:val="ro-RO"/>
               </w:rPr>
-              <w:t>Activitatea economică în care s-a produs incidentul (cod CAEN)</w:t>
+              <w:t xml:space="preserve">Activitatea economică în care s-a produs incidentul (Cod CAEN)</w:t>
             </w:r>
           </w:p>
         </w:tc>
@@ -12090,7 +12090,7 @@
                 <w:szCs w:val="16"/>
                 <w:lang w:val="ro-RO"/>
               </w:rPr>
-              <w:t>vechime la locul de muncă</w:t>
+              <w:t xml:space="preserve">vechime la loc de muncă</w:t>
             </w:r>
           </w:p>
         </w:tc>
@@ -12231,7 +12231,7 @@
                 <w:szCs w:val="16"/>
                 <w:lang w:val="ro-RO"/>
               </w:rPr>
-              <w:t>Activitatea economică în care s-a accidentat victima (cod CAEN)</w:t>
+              <w:t xml:space="preserve">Activitatea economică în care s-a accidentat victima (Cod CAEN)</w:t>
             </w:r>
           </w:p>
         </w:tc>
@@ -12372,7 +12372,7 @@
                 <w:szCs w:val="16"/>
                 <w:lang w:val="ro-RO"/>
               </w:rPr>
-              <w:t>Data, ora accidentării</w:t>
+              <w:t xml:space="preserve">Data/ora accidentării</w:t>
             </w:r>
           </w:p>
         </w:tc>
@@ -18589,7 +18589,7 @@
                 <w:szCs w:val="14"/>
                 <w:lang w:val="ro-RO"/>
               </w:rPr>
-              <w:t>vechime la locul de muncă</w:t>
+              <w:t xml:space="preserve">vechime la loc de muncă</w:t>
             </w:r>
           </w:p>
         </w:tc>
@@ -18730,7 +18730,7 @@
                 <w:szCs w:val="14"/>
                 <w:lang w:val="ro-RO"/>
               </w:rPr>
-              <w:t>Activitatea economică în care s-a accidentat victima (cod CAEN)</w:t>
+              <w:t xml:space="preserve">Activitatea economică în care s-a accidentat victima (Cod CAEN)</w:t>
             </w:r>
           </w:p>
         </w:tc>
@@ -18777,7 +18777,7 @@
                 <w:szCs w:val="14"/>
                 <w:lang w:val="ro-RO"/>
               </w:rPr>
-              <w:t>Împrejurarea, cauzele accidentării</w:t>
+              <w:t xml:space="preserve">Împrejurare, cauzele accidentării</w:t>
             </w:r>
           </w:p>
         </w:tc>
@@ -19558,7 +19558,7 @@
                 <w:szCs w:val="14"/>
                 <w:lang w:val="ro-RO"/>
               </w:rPr>
-              <w:t>Invaliditate: nr., data deciziei; grad inv.</w:t>
+              <w:t xml:space="preserve">Invaliditate Nr.; data deciziei; grad inv.</w:t>
             </w:r>
           </w:p>
         </w:tc>

</xml_diff>